<commit_message>
added Surprise me, Movies / TV toggle, and My List features ...
</commit_message>
<xml_diff>
--- a/docs/Reel-Setup-Guide.docx
+++ b/docs/Reel-Setup-Guide.docx
@@ -97,12 +97,6 @@
         <w:gridCol w:w="6760"/>
       </w:tblGrid>
       <w:tr>
-        <w:tblPrEx>
-          <w:tblCellMar>
-            <w:top w:w="0" w:type="dxa"/>
-            <w:bottom w:w="0" w:type="dxa"/>
-          </w:tblCellMar>
-        </w:tblPrEx>
         <w:tc>
           <w:tcPr>
             <w:tcW w:w="2600" w:type="dxa"/>
@@ -163,12 +157,6 @@
         </w:tc>
       </w:tr>
       <w:tr>
-        <w:tblPrEx>
-          <w:tblCellMar>
-            <w:top w:w="0" w:type="dxa"/>
-            <w:bottom w:w="0" w:type="dxa"/>
-          </w:tblCellMar>
-        </w:tblPrEx>
         <w:tc>
           <w:tcPr>
             <w:tcW w:w="2600" w:type="dxa"/>
@@ -229,12 +217,6 @@
         </w:tc>
       </w:tr>
       <w:tr>
-        <w:tblPrEx>
-          <w:tblCellMar>
-            <w:top w:w="0" w:type="dxa"/>
-            <w:bottom w:w="0" w:type="dxa"/>
-          </w:tblCellMar>
-        </w:tblPrEx>
         <w:tc>
           <w:tcPr>
             <w:tcW w:w="2600" w:type="dxa"/>
@@ -295,12 +277,6 @@
         </w:tc>
       </w:tr>
       <w:tr>
-        <w:tblPrEx>
-          <w:tblCellMar>
-            <w:top w:w="0" w:type="dxa"/>
-            <w:bottom w:w="0" w:type="dxa"/>
-          </w:tblCellMar>
-        </w:tblPrEx>
         <w:tc>
           <w:tcPr>
             <w:tcW w:w="2600" w:type="dxa"/>
@@ -361,12 +337,6 @@
         </w:tc>
       </w:tr>
       <w:tr>
-        <w:tblPrEx>
-          <w:tblCellMar>
-            <w:top w:w="0" w:type="dxa"/>
-            <w:bottom w:w="0" w:type="dxa"/>
-          </w:tblCellMar>
-        </w:tblPrEx>
         <w:tc>
           <w:tcPr>
             <w:tcW w:w="2600" w:type="dxa"/>
@@ -427,12 +397,6 @@
         </w:tc>
       </w:tr>
       <w:tr>
-        <w:tblPrEx>
-          <w:tblCellMar>
-            <w:top w:w="0" w:type="dxa"/>
-            <w:bottom w:w="0" w:type="dxa"/>
-          </w:tblCellMar>
-        </w:tblPrEx>
         <w:tc>
           <w:tcPr>
             <w:tcW w:w="2600" w:type="dxa"/>
@@ -597,12 +561,6 @@
         <w:gridCol w:w="6760"/>
       </w:tblGrid>
       <w:tr>
-        <w:tblPrEx>
-          <w:tblCellMar>
-            <w:top w:w="0" w:type="dxa"/>
-            <w:bottom w:w="0" w:type="dxa"/>
-          </w:tblCellMar>
-        </w:tblPrEx>
         <w:tc>
           <w:tcPr>
             <w:tcW w:w="2600" w:type="dxa"/>
@@ -663,12 +621,6 @@
         </w:tc>
       </w:tr>
       <w:tr>
-        <w:tblPrEx>
-          <w:tblCellMar>
-            <w:top w:w="0" w:type="dxa"/>
-            <w:bottom w:w="0" w:type="dxa"/>
-          </w:tblCellMar>
-        </w:tblPrEx>
         <w:tc>
           <w:tcPr>
             <w:tcW w:w="2600" w:type="dxa"/>
@@ -729,12 +681,6 @@
         </w:tc>
       </w:tr>
       <w:tr>
-        <w:tblPrEx>
-          <w:tblCellMar>
-            <w:top w:w="0" w:type="dxa"/>
-            <w:bottom w:w="0" w:type="dxa"/>
-          </w:tblCellMar>
-        </w:tblPrEx>
         <w:tc>
           <w:tcPr>
             <w:tcW w:w="2600" w:type="dxa"/>
@@ -811,12 +757,6 @@
         </w:tc>
       </w:tr>
       <w:tr>
-        <w:tblPrEx>
-          <w:tblCellMar>
-            <w:top w:w="0" w:type="dxa"/>
-            <w:bottom w:w="0" w:type="dxa"/>
-          </w:tblCellMar>
-        </w:tblPrEx>
         <w:tc>
           <w:tcPr>
             <w:tcW w:w="2600" w:type="dxa"/>
@@ -877,12 +817,6 @@
         </w:tc>
       </w:tr>
       <w:tr>
-        <w:tblPrEx>
-          <w:tblCellMar>
-            <w:top w:w="0" w:type="dxa"/>
-            <w:bottom w:w="0" w:type="dxa"/>
-          </w:tblCellMar>
-        </w:tblPrEx>
         <w:tc>
           <w:tcPr>
             <w:tcW w:w="2600" w:type="dxa"/>
@@ -943,12 +877,6 @@
         </w:tc>
       </w:tr>
       <w:tr>
-        <w:tblPrEx>
-          <w:tblCellMar>
-            <w:top w:w="0" w:type="dxa"/>
-            <w:bottom w:w="0" w:type="dxa"/>
-          </w:tblCellMar>
-        </w:tblPrEx>
         <w:tc>
           <w:tcPr>
             <w:tcW w:w="2600" w:type="dxa"/>
@@ -1009,12 +937,6 @@
         </w:tc>
       </w:tr>
       <w:tr>
-        <w:tblPrEx>
-          <w:tblCellMar>
-            <w:top w:w="0" w:type="dxa"/>
-            <w:bottom w:w="0" w:type="dxa"/>
-          </w:tblCellMar>
-        </w:tblPrEx>
         <w:tc>
           <w:tcPr>
             <w:tcW w:w="2600" w:type="dxa"/>
@@ -1076,12 +998,6 @@
         </w:tc>
       </w:tr>
       <w:tr>
-        <w:tblPrEx>
-          <w:tblCellMar>
-            <w:top w:w="0" w:type="dxa"/>
-            <w:bottom w:w="0" w:type="dxa"/>
-          </w:tblCellMar>
-        </w:tblPrEx>
         <w:tc>
           <w:tcPr>
             <w:tcW w:w="2600" w:type="dxa"/>
@@ -1142,12 +1058,6 @@
         </w:tc>
       </w:tr>
       <w:tr>
-        <w:tblPrEx>
-          <w:tblCellMar>
-            <w:top w:w="0" w:type="dxa"/>
-            <w:bottom w:w="0" w:type="dxa"/>
-          </w:tblCellMar>
-        </w:tblPrEx>
         <w:tc>
           <w:tcPr>
             <w:tcW w:w="2600" w:type="dxa"/>
@@ -1208,12 +1118,6 @@
         </w:tc>
       </w:tr>
       <w:tr>
-        <w:tblPrEx>
-          <w:tblCellMar>
-            <w:top w:w="0" w:type="dxa"/>
-            <w:bottom w:w="0" w:type="dxa"/>
-          </w:tblCellMar>
-        </w:tblPrEx>
         <w:tc>
           <w:tcPr>
             <w:tcW w:w="2600" w:type="dxa"/>
@@ -1312,12 +1216,6 @@
         <w:gridCol w:w="6760"/>
       </w:tblGrid>
       <w:tr>
-        <w:tblPrEx>
-          <w:tblCellMar>
-            <w:top w:w="0" w:type="dxa"/>
-            <w:bottom w:w="0" w:type="dxa"/>
-          </w:tblCellMar>
-        </w:tblPrEx>
         <w:tc>
           <w:tcPr>
             <w:tcW w:w="2600" w:type="dxa"/>
@@ -1378,12 +1276,6 @@
         </w:tc>
       </w:tr>
       <w:tr>
-        <w:tblPrEx>
-          <w:tblCellMar>
-            <w:top w:w="0" w:type="dxa"/>
-            <w:bottom w:w="0" w:type="dxa"/>
-          </w:tblCellMar>
-        </w:tblPrEx>
         <w:tc>
           <w:tcPr>
             <w:tcW w:w="2600" w:type="dxa"/>
@@ -1444,12 +1336,6 @@
         </w:tc>
       </w:tr>
       <w:tr>
-        <w:tblPrEx>
-          <w:tblCellMar>
-            <w:top w:w="0" w:type="dxa"/>
-            <w:bottom w:w="0" w:type="dxa"/>
-          </w:tblCellMar>
-        </w:tblPrEx>
         <w:tc>
           <w:tcPr>
             <w:tcW w:w="2600" w:type="dxa"/>
@@ -1510,12 +1396,6 @@
         </w:tc>
       </w:tr>
       <w:tr>
-        <w:tblPrEx>
-          <w:tblCellMar>
-            <w:top w:w="0" w:type="dxa"/>
-            <w:bottom w:w="0" w:type="dxa"/>
-          </w:tblCellMar>
-        </w:tblPrEx>
         <w:tc>
           <w:tcPr>
             <w:tcW w:w="2600" w:type="dxa"/>
@@ -1576,12 +1456,6 @@
         </w:tc>
       </w:tr>
       <w:tr>
-        <w:tblPrEx>
-          <w:tblCellMar>
-            <w:top w:w="0" w:type="dxa"/>
-            <w:bottom w:w="0" w:type="dxa"/>
-          </w:tblCellMar>
-        </w:tblPrEx>
         <w:tc>
           <w:tcPr>
             <w:tcW w:w="2600" w:type="dxa"/>
@@ -2251,6 +2125,145 @@
     </w:p>
     <w:p>
       <w:pPr>
+        <w:spacing w:after="80"/>
+      </w:pPr>
+    </w:p>
+    <w:p>
+      <w:pPr>
+        <w:pStyle w:val="Heading1"/>
+      </w:pPr>
+      <w:r>
+        <w:t>When the curated fallback happens</w:t>
+      </w:r>
+    </w:p>
+    <w:p>
+      <w:pPr>
+        <w:spacing w:after="80"/>
+      </w:pPr>
+      <w:r>
+        <w:t>The app shows the hardcoded curated list (Bullet Train, The Rock, etc.) instead of live data whenever the live path fails. Specifically, in these cases:</w:t>
+      </w:r>
+    </w:p>
+    <w:p>
+      <w:pPr>
+        <w:numPr>
+          <w:ilvl w:val="0"/>
+          <w:numId w:val="7"/>
+        </w:numPr>
+        <w:spacing w:after="80"/>
+      </w:pPr>
+      <w:r>
+        <w:rPr>
+          <w:b/>
+          <w:bCs/>
+        </w:rPr>
+        <w:t>No Worker URL saved</w:t>
+      </w:r>
+      <w:r>
+        <w:t xml:space="preserve"> — you haven't entered it via </w:t>
+      </w:r>
+      <w:r>
+        <w:rPr>
+          <w:rFonts w:ascii="Segoe UI Symbol" w:hAnsi="Segoe UI Symbol" w:cs="Segoe UI Symbol"/>
+        </w:rPr>
+        <w:t>⚙</w:t>
+      </w:r>
+      <w:r>
+        <w:t xml:space="preserve"> Live, or it got cleared (new device, cleared Safari data). Note line says "Enable live picks →".</w:t>
+      </w:r>
+    </w:p>
+    <w:p>
+      <w:pPr>
+        <w:numPr>
+          <w:ilvl w:val="0"/>
+          <w:numId w:val="7"/>
+        </w:numPr>
+        <w:spacing w:after="80"/>
+      </w:pPr>
+      <w:r>
+        <w:rPr>
+          <w:b/>
+          <w:bCs/>
+        </w:rPr>
+        <w:t>The Worker call fails</w:t>
+      </w:r>
+      <w:r>
+        <w:t xml:space="preserve"> — wrong/typo'd Worker URL, or opening the app as a local file:// instead of the GitHub Pages URL. Note says "network-fail".</w:t>
+      </w:r>
+    </w:p>
+    <w:p>
+      <w:pPr>
+        <w:numPr>
+          <w:ilvl w:val="0"/>
+          <w:numId w:val="7"/>
+        </w:numPr>
+        <w:spacing w:after="80"/>
+      </w:pPr>
+      <w:r>
+        <w:rPr>
+          <w:b/>
+          <w:bCs/>
+        </w:rPr>
+        <w:lastRenderedPageBreak/>
+        <w:t>The request times out</w:t>
+      </w:r>
+      <w:r>
+        <w:t xml:space="preserve"> — I set a 12-second limit, so if the network stalls it gives up rather than spinning forever. Note says "timeout".</w:t>
+      </w:r>
+    </w:p>
+    <w:p>
+      <w:pPr>
+        <w:numPr>
+          <w:ilvl w:val="0"/>
+          <w:numId w:val="7"/>
+        </w:numPr>
+        <w:spacing w:after="80"/>
+      </w:pPr>
+      <w:r>
+        <w:rPr>
+          <w:b/>
+          <w:bCs/>
+        </w:rPr>
+        <w:t>Watchmode returns an error</w:t>
+      </w:r>
+      <w:r>
+        <w:t xml:space="preserve"> — bad/missing key secret (http-401/403), or a server hiccup.</w:t>
+      </w:r>
+    </w:p>
+    <w:p>
+      <w:pPr>
+        <w:numPr>
+          <w:ilvl w:val="0"/>
+          <w:numId w:val="7"/>
+        </w:numPr>
+        <w:spacing w:after="80"/>
+      </w:pPr>
+      <w:r>
+        <w:rPr>
+          <w:b/>
+          <w:bCs/>
+        </w:rPr>
+        <w:t>Watchmode returns zero titles</w:t>
+      </w:r>
+      <w:r>
+        <w:t xml:space="preserve"> — e.g. a genre with nothing free in your selected region. Note says "no free movies in this genre for [region]".</w:t>
+      </w:r>
+    </w:p>
+    <w:p>
+      <w:pPr>
+        <w:spacing w:after="80"/>
+      </w:pPr>
+      <w:r>
+        <w:t>In every case the app catches the problem, drops to the curated list, and prints the reason in the grey note line. It's a safety net so you never get a blank screen. When live works, you see posters + the "● live" badge; when it's the fallback, you see the numbered text cards with "Was free on… at build."</w:t>
+      </w:r>
+    </w:p>
+    <w:p>
+      <w:pPr>
+        <w:spacing w:after="80"/>
+      </w:pPr>
+    </w:p>
+    <w:p>
+      <w:pPr>
         <w:pStyle w:val="Heading1"/>
       </w:pPr>
       <w:r>
@@ -2328,7 +2341,6 @@
         <w:pStyle w:val="Heading2"/>
       </w:pPr>
       <w:r>
-        <w:lastRenderedPageBreak/>
         <w:t>Update the app</w:t>
       </w:r>
     </w:p>
@@ -2426,12 +2438,6 @@
         <w:gridCol w:w="5960"/>
       </w:tblGrid>
       <w:tr>
-        <w:tblPrEx>
-          <w:tblCellMar>
-            <w:top w:w="0" w:type="dxa"/>
-            <w:bottom w:w="0" w:type="dxa"/>
-          </w:tblCellMar>
-        </w:tblPrEx>
         <w:tc>
           <w:tcPr>
             <w:tcW w:w="3400" w:type="dxa"/>
@@ -2492,12 +2498,6 @@
         </w:tc>
       </w:tr>
       <w:tr>
-        <w:tblPrEx>
-          <w:tblCellMar>
-            <w:top w:w="0" w:type="dxa"/>
-            <w:bottom w:w="0" w:type="dxa"/>
-          </w:tblCellMar>
-        </w:tblPrEx>
         <w:tc>
           <w:tcPr>
             <w:tcW w:w="3400" w:type="dxa"/>
@@ -2558,12 +2558,6 @@
         </w:tc>
       </w:tr>
       <w:tr>
-        <w:tblPrEx>
-          <w:tblCellMar>
-            <w:top w:w="0" w:type="dxa"/>
-            <w:bottom w:w="0" w:type="dxa"/>
-          </w:tblCellMar>
-        </w:tblPrEx>
         <w:tc>
           <w:tcPr>
             <w:tcW w:w="3400" w:type="dxa"/>
@@ -2624,12 +2618,6 @@
         </w:tc>
       </w:tr>
       <w:tr>
-        <w:tblPrEx>
-          <w:tblCellMar>
-            <w:top w:w="0" w:type="dxa"/>
-            <w:bottom w:w="0" w:type="dxa"/>
-          </w:tblCellMar>
-        </w:tblPrEx>
         <w:tc>
           <w:tcPr>
             <w:tcW w:w="3400" w:type="dxa"/>
@@ -2656,6 +2644,7 @@
                 <w:sz w:val="19"/>
                 <w:szCs w:val="19"/>
               </w:rPr>
+              <w:lastRenderedPageBreak/>
               <w:t>"http-401" or "http-403"</w:t>
             </w:r>
           </w:p>
@@ -2690,12 +2679,6 @@
         </w:tc>
       </w:tr>
       <w:tr>
-        <w:tblPrEx>
-          <w:tblCellMar>
-            <w:top w:w="0" w:type="dxa"/>
-            <w:bottom w:w="0" w:type="dxa"/>
-          </w:tblCellMar>
-        </w:tblPrEx>
         <w:tc>
           <w:tcPr>
             <w:tcW w:w="3400" w:type="dxa"/>
@@ -2756,12 +2739,6 @@
         </w:tc>
       </w:tr>
       <w:tr>
-        <w:tblPrEx>
-          <w:tblCellMar>
-            <w:top w:w="0" w:type="dxa"/>
-            <w:bottom w:w="0" w:type="dxa"/>
-          </w:tblCellMar>
-        </w:tblPrEx>
         <w:tc>
           <w:tcPr>
             <w:tcW w:w="3400" w:type="dxa"/>
@@ -2822,12 +2799,6 @@
         </w:tc>
       </w:tr>
       <w:tr>
-        <w:tblPrEx>
-          <w:tblCellMar>
-            <w:top w:w="0" w:type="dxa"/>
-            <w:bottom w:w="0" w:type="dxa"/>
-          </w:tblCellMar>
-        </w:tblPrEx>
         <w:tc>
           <w:tcPr>
             <w:tcW w:w="3400" w:type="dxa"/>
@@ -2888,12 +2859,6 @@
         </w:tc>
       </w:tr>
       <w:tr>
-        <w:tblPrEx>
-          <w:tblCellMar>
-            <w:top w:w="0" w:type="dxa"/>
-            <w:bottom w:w="0" w:type="dxa"/>
-          </w:tblCellMar>
-        </w:tblPrEx>
         <w:tc>
           <w:tcPr>
             <w:tcW w:w="3400" w:type="dxa"/>
@@ -3016,7 +2981,6 @@
           <w:b/>
           <w:bCs/>
         </w:rPr>
-        <w:lastRenderedPageBreak/>
         <w:t xml:space="preserve">Service worker: </w:t>
       </w:r>
       <w:r>
@@ -3588,6 +3552,155 @@
       <w:lvlJc w:val="left"/>
     </w:lvl>
   </w:abstractNum>
+  <w:abstractNum w:abstractNumId="6" w15:restartNumberingAfterBreak="0">
+    <w:nsid w:val="6F393AE9"/>
+    <w:multiLevelType w:val="multilevel"/>
+    <w:tmpl w:val="8D22F2C4"/>
+    <w:lvl w:ilvl="0">
+      <w:start w:val="1"/>
+      <w:numFmt w:val="bullet"/>
+      <w:lvlText w:val=""/>
+      <w:lvlJc w:val="left"/>
+      <w:pPr>
+        <w:tabs>
+          <w:tab w:val="num" w:pos="720"/>
+        </w:tabs>
+        <w:ind w:left="720" w:hanging="360"/>
+      </w:pPr>
+      <w:rPr>
+        <w:rFonts w:ascii="Symbol" w:hAnsi="Symbol" w:hint="default"/>
+        <w:sz w:val="20"/>
+      </w:rPr>
+    </w:lvl>
+    <w:lvl w:ilvl="1" w:tentative="1">
+      <w:start w:val="1"/>
+      <w:numFmt w:val="bullet"/>
+      <w:lvlText w:val="o"/>
+      <w:lvlJc w:val="left"/>
+      <w:pPr>
+        <w:tabs>
+          <w:tab w:val="num" w:pos="1440"/>
+        </w:tabs>
+        <w:ind w:left="1440" w:hanging="360"/>
+      </w:pPr>
+      <w:rPr>
+        <w:rFonts w:ascii="Courier New" w:hAnsi="Courier New" w:hint="default"/>
+        <w:sz w:val="20"/>
+      </w:rPr>
+    </w:lvl>
+    <w:lvl w:ilvl="2" w:tentative="1">
+      <w:start w:val="1"/>
+      <w:numFmt w:val="bullet"/>
+      <w:lvlText w:val=""/>
+      <w:lvlJc w:val="left"/>
+      <w:pPr>
+        <w:tabs>
+          <w:tab w:val="num" w:pos="2160"/>
+        </w:tabs>
+        <w:ind w:left="2160" w:hanging="360"/>
+      </w:pPr>
+      <w:rPr>
+        <w:rFonts w:ascii="Wingdings" w:hAnsi="Wingdings" w:hint="default"/>
+        <w:sz w:val="20"/>
+      </w:rPr>
+    </w:lvl>
+    <w:lvl w:ilvl="3" w:tentative="1">
+      <w:start w:val="1"/>
+      <w:numFmt w:val="bullet"/>
+      <w:lvlText w:val=""/>
+      <w:lvlJc w:val="left"/>
+      <w:pPr>
+        <w:tabs>
+          <w:tab w:val="num" w:pos="2880"/>
+        </w:tabs>
+        <w:ind w:left="2880" w:hanging="360"/>
+      </w:pPr>
+      <w:rPr>
+        <w:rFonts w:ascii="Wingdings" w:hAnsi="Wingdings" w:hint="default"/>
+        <w:sz w:val="20"/>
+      </w:rPr>
+    </w:lvl>
+    <w:lvl w:ilvl="4" w:tentative="1">
+      <w:start w:val="1"/>
+      <w:numFmt w:val="bullet"/>
+      <w:lvlText w:val=""/>
+      <w:lvlJc w:val="left"/>
+      <w:pPr>
+        <w:tabs>
+          <w:tab w:val="num" w:pos="3600"/>
+        </w:tabs>
+        <w:ind w:left="3600" w:hanging="360"/>
+      </w:pPr>
+      <w:rPr>
+        <w:rFonts w:ascii="Wingdings" w:hAnsi="Wingdings" w:hint="default"/>
+        <w:sz w:val="20"/>
+      </w:rPr>
+    </w:lvl>
+    <w:lvl w:ilvl="5" w:tentative="1">
+      <w:start w:val="1"/>
+      <w:numFmt w:val="bullet"/>
+      <w:lvlText w:val=""/>
+      <w:lvlJc w:val="left"/>
+      <w:pPr>
+        <w:tabs>
+          <w:tab w:val="num" w:pos="4320"/>
+        </w:tabs>
+        <w:ind w:left="4320" w:hanging="360"/>
+      </w:pPr>
+      <w:rPr>
+        <w:rFonts w:ascii="Wingdings" w:hAnsi="Wingdings" w:hint="default"/>
+        <w:sz w:val="20"/>
+      </w:rPr>
+    </w:lvl>
+    <w:lvl w:ilvl="6" w:tentative="1">
+      <w:start w:val="1"/>
+      <w:numFmt w:val="bullet"/>
+      <w:lvlText w:val=""/>
+      <w:lvlJc w:val="left"/>
+      <w:pPr>
+        <w:tabs>
+          <w:tab w:val="num" w:pos="5040"/>
+        </w:tabs>
+        <w:ind w:left="5040" w:hanging="360"/>
+      </w:pPr>
+      <w:rPr>
+        <w:rFonts w:ascii="Wingdings" w:hAnsi="Wingdings" w:hint="default"/>
+        <w:sz w:val="20"/>
+      </w:rPr>
+    </w:lvl>
+    <w:lvl w:ilvl="7" w:tentative="1">
+      <w:start w:val="1"/>
+      <w:numFmt w:val="bullet"/>
+      <w:lvlText w:val=""/>
+      <w:lvlJc w:val="left"/>
+      <w:pPr>
+        <w:tabs>
+          <w:tab w:val="num" w:pos="5760"/>
+        </w:tabs>
+        <w:ind w:left="5760" w:hanging="360"/>
+      </w:pPr>
+      <w:rPr>
+        <w:rFonts w:ascii="Wingdings" w:hAnsi="Wingdings" w:hint="default"/>
+        <w:sz w:val="20"/>
+      </w:rPr>
+    </w:lvl>
+    <w:lvl w:ilvl="8" w:tentative="1">
+      <w:start w:val="1"/>
+      <w:numFmt w:val="bullet"/>
+      <w:lvlText w:val=""/>
+      <w:lvlJc w:val="left"/>
+      <w:pPr>
+        <w:tabs>
+          <w:tab w:val="num" w:pos="6480"/>
+        </w:tabs>
+        <w:ind w:left="6480" w:hanging="360"/>
+      </w:pPr>
+      <w:rPr>
+        <w:rFonts w:ascii="Wingdings" w:hAnsi="Wingdings" w:hint="default"/>
+        <w:sz w:val="20"/>
+      </w:rPr>
+    </w:lvl>
+  </w:abstractNum>
   <w:num w:numId="1" w16cid:durableId="769082892">
     <w:abstractNumId w:val="1"/>
     <w:lvlOverride w:ilvl="0">
@@ -3623,6 +3736,9 @@
     <w:lvlOverride w:ilvl="0">
       <w:startOverride w:val="1"/>
     </w:lvlOverride>
+  </w:num>
+  <w:num w:numId="7" w16cid:durableId="2020892282">
+    <w:abstractNumId w:val="6"/>
   </w:num>
 </w:numbering>
 </file>
@@ -4118,7 +4234,6 @@
   <w:style w:type="character" w:default="1" w:styleId="DefaultParagraphFont">
     <w:name w:val="Default Paragraph Font"/>
     <w:uiPriority w:val="1"/>
-    <w:semiHidden/>
     <w:unhideWhenUsed/>
   </w:style>
   <w:style w:type="table" w:default="1" w:styleId="TableNormal">

</xml_diff>